<commit_message>
Fp pour TOUS les instruments (fallback Yan_Adds specenv: + → - mapping), Piccolo Fp=1320, ensembles+sourdines Fp calculés, document complet régénéré
</commit_message>
<xml_diff>
--- a/Versions-html-and-docx/section_bois_v5.docx
+++ b/Versions-html-and-docx/section_bois_v5.docx
@@ -177,6 +177,17 @@
           <w:sz w:val="20"/>
         </w:rPr>
         <w:t>Instrument le plus aigu spectralement de l'orchestre. Comme la grande flûte, il ne possède pas de formant fixe au sens strict — son énergie spectrale est concentrée dans les hautes fréquences (F1=1 109 Hz, zone /e/). Backus cite ~3 400 Hz correspondant au Fp ou au sommet de la courbe de rayonnement. Fp non calculé dans le corpus actuel. La variation dynamique est marquée : la piccolo projette dans les aigu extrêmes en forte.</w:t>
+      </w:r>
+    </w:p>
+    <w:p>
+      <w:r>
+        <w:rPr>
+          <w:b/>
+          <w:i w:val="0"/>
+          <w:color w:val="1B5E20"/>
+          <w:sz w:val="20"/>
+        </w:rPr>
+        <w:t>Fp (centroïde) = 1320 Hz</w:t>
       </w:r>
     </w:p>
     <w:p>

</xml_diff>

<commit_message>
Anti-collision v6: vertical-first, Fp toujours affiché sans flèche, police réduite pour spectres denses, 49/49 sans collision — document complet régénéré
</commit_message>
<xml_diff>
--- a/Versions-html-and-docx/section_bois_v5.docx
+++ b/Versions-html-and-docx/section_bois_v5.docx
@@ -137,7 +137,7 @@
       <w:r>
         <w:drawing>
           <wp:inline xmlns:a="http://schemas.openxmlformats.org/drawingml/2006/main" xmlns:pic="http://schemas.openxmlformats.org/drawingml/2006/picture">
-            <wp:extent cx="5943600" cy="2944613"/>
+            <wp:extent cx="5943600" cy="2948763"/>
             <wp:docPr id="1" name="Picture 1"/>
             <wp:cNvGraphicFramePr>
               <a:graphicFrameLocks noChangeAspect="1"/>
@@ -158,7 +158,7 @@
                   <pic:spPr>
                     <a:xfrm>
                       <a:off x="0" y="0"/>
-                      <a:ext cx="5943600" cy="2944613"/>
+                      <a:ext cx="5943600" cy="2948763"/>
                     </a:xfrm>
                     <a:prstGeom prst="rect"/>
                   </pic:spPr>
@@ -24985,7 +24985,7 @@
       <w:r>
         <w:drawing>
           <wp:inline xmlns:a="http://schemas.openxmlformats.org/drawingml/2006/main" xmlns:pic="http://schemas.openxmlformats.org/drawingml/2006/picture">
-            <wp:extent cx="5943600" cy="2944613"/>
+            <wp:extent cx="5943600" cy="2938409"/>
             <wp:docPr id="9" name="Picture 9"/>
             <wp:cNvGraphicFramePr>
               <a:graphicFrameLocks noChangeAspect="1"/>
@@ -25006,7 +25006,7 @@
                   <pic:spPr>
                     <a:xfrm>
                       <a:off x="0" y="0"/>
-                      <a:ext cx="5943600" cy="2944613"/>
+                      <a:ext cx="5943600" cy="2938409"/>
                     </a:xfrm>
                     <a:prstGeom prst="rect"/>
                   </pic:spPr>
@@ -31233,7 +31233,7 @@
       <w:r>
         <w:drawing>
           <wp:inline xmlns:a="http://schemas.openxmlformats.org/drawingml/2006/main" xmlns:pic="http://schemas.openxmlformats.org/drawingml/2006/picture">
-            <wp:extent cx="5943600" cy="2940474"/>
+            <wp:extent cx="5943600" cy="2936347"/>
             <wp:docPr id="11" name="Picture 11"/>
             <wp:cNvGraphicFramePr>
               <a:graphicFrameLocks noChangeAspect="1"/>
@@ -31254,7 +31254,7 @@
                   <pic:spPr>
                     <a:xfrm>
                       <a:off x="0" y="0"/>
-                      <a:ext cx="5943600" cy="2940474"/>
+                      <a:ext cx="5943600" cy="2936347"/>
                     </a:xfrm>
                     <a:prstGeom prst="rect"/>
                   </pic:spPr>

</xml_diff>